<commit_message>
Update report document generation and improve member data handling
- Enhanced the report document template to include commission members' positions and improved formatting for better clarity.
- Refactored API functions to load commission member names with additional context for document generation.
- Updated utility functions to streamline the report generation process, ensuring accurate data representation.
- Improved the handling of certificate numbers and group order numbers in the document payload.
</commit_message>
<xml_diff>
--- a/forms/report.docx
+++ b/forms/report.docx
@@ -217,7 +217,6 @@
         </w:rPr>
         <w:t>chairperson</w:t>
       </w:r>
-      <w:proofErr w:type="spellEnd"/>
       <w:r>
         <w:rPr>
           <w:b/>
@@ -226,35 +225,9 @@
           <w:szCs w:val="24"/>
           <w:lang w:val="uk-UA"/>
         </w:rPr>
-        <w:t>}</w:t>
-      </w:r>
-      <w:r>
-        <w:rPr>
-          <w:snapToGrid w:val="0"/>
-          <w:sz w:val="24"/>
-          <w:szCs w:val="24"/>
-          <w:lang w:val="uk-UA"/>
-        </w:rPr>
-        <w:t xml:space="preserve"> </w:t>
-      </w:r>
-      <w:r>
-        <w:rPr>
-          <w:snapToGrid w:val="0"/>
-          <w:sz w:val="24"/>
-          <w:szCs w:val="24"/>
-          <w:lang w:val="uk-UA"/>
-        </w:rPr>
-        <w:t>та членів комісії</w:t>
-      </w:r>
-      <w:r>
-        <w:rPr>
-          <w:snapToGrid w:val="0"/>
-          <w:sz w:val="24"/>
-          <w:szCs w:val="24"/>
-          <w:lang w:val="uk-UA"/>
-        </w:rPr>
-        <w:t xml:space="preserve"> </w:t>
-      </w:r>
+        <w:t>-with-position</w:t>
+      </w:r>
+      <w:proofErr w:type="spellEnd"/>
       <w:r>
         <w:rPr>
           <w:b/>
@@ -263,9 +236,35 @@
           <w:szCs w:val="24"/>
           <w:lang w:val="uk-UA"/>
         </w:rPr>
-        <w:t>{</w:t>
-      </w:r>
-      <w:proofErr w:type="spellStart"/>
+        <w:t>}</w:t>
+      </w:r>
+      <w:r>
+        <w:rPr>
+          <w:snapToGrid w:val="0"/>
+          <w:sz w:val="24"/>
+          <w:szCs w:val="24"/>
+          <w:lang w:val="uk-UA"/>
+        </w:rPr>
+        <w:t xml:space="preserve"> </w:t>
+      </w:r>
+      <w:r>
+        <w:rPr>
+          <w:snapToGrid w:val="0"/>
+          <w:sz w:val="24"/>
+          <w:szCs w:val="24"/>
+          <w:lang w:val="uk-UA"/>
+        </w:rPr>
+        <w:t>та членів комісії</w:t>
+      </w:r>
+      <w:r>
+        <w:rPr>
+          <w:snapToGrid w:val="0"/>
+          <w:sz w:val="24"/>
+          <w:szCs w:val="24"/>
+          <w:lang w:val="uk-UA"/>
+        </w:rPr>
+        <w:t xml:space="preserve"> </w:t>
+      </w:r>
       <w:r>
         <w:rPr>
           <w:b/>
@@ -274,7 +273,28 @@
           <w:szCs w:val="24"/>
           <w:lang w:val="uk-UA"/>
         </w:rPr>
+        <w:t>{</w:t>
+      </w:r>
+      <w:proofErr w:type="spellStart"/>
+      <w:r>
+        <w:rPr>
+          <w:b/>
+          <w:bCs/>
+          <w:sz w:val="24"/>
+          <w:szCs w:val="24"/>
+          <w:lang w:val="uk-UA"/>
+        </w:rPr>
         <w:t>members</w:t>
+      </w:r>
+      <w:r>
+        <w:rPr>
+          <w:b/>
+          <w:bCs/>
+          <w:sz w:val="24"/>
+          <w:szCs w:val="24"/>
+          <w:lang w:val="uk-UA"/>
+        </w:rPr>
+        <w:t>-with-position</w:t>
       </w:r>
       <w:proofErr w:type="spellEnd"/>
       <w:r>
@@ -395,7 +415,7 @@
     <w:p>
       <w:pPr>
         <w:rPr>
-          <w:lang w:val="en-US"/>
+          <w:lang w:val="uk-UA"/>
         </w:rPr>
       </w:pPr>
     </w:p>
@@ -420,8 +440,8 @@
         <w:tblLook w:val="0000" w:firstRow="0" w:lastRow="0" w:firstColumn="0" w:lastColumn="0" w:noHBand="0" w:noVBand="0"/>
       </w:tblPr>
       <w:tblGrid>
-        <w:gridCol w:w="392"/>
-        <w:gridCol w:w="1054"/>
+        <w:gridCol w:w="421"/>
+        <w:gridCol w:w="1025"/>
         <w:gridCol w:w="3794"/>
         <w:gridCol w:w="2126"/>
         <w:gridCol w:w="1701"/>
@@ -431,7 +451,7 @@
       <w:tr>
         <w:tc>
           <w:tcPr>
-            <w:tcW w:w="392" w:type="dxa"/>
+            <w:tcW w:w="421" w:type="dxa"/>
           </w:tcPr>
           <w:p>
             <w:pPr>
@@ -464,7 +484,7 @@
         </w:tc>
         <w:tc>
           <w:tcPr>
-            <w:tcW w:w="1054" w:type="dxa"/>
+            <w:tcW w:w="1025" w:type="dxa"/>
           </w:tcPr>
           <w:p>
             <w:pPr>
@@ -606,7 +626,7 @@
       <w:tr>
         <w:tc>
           <w:tcPr>
-            <w:tcW w:w="392" w:type="dxa"/>
+            <w:tcW w:w="421" w:type="dxa"/>
           </w:tcPr>
           <w:p>
             <w:pPr>
@@ -621,53 +641,27 @@
                 <w:bCs/>
                 <w:lang w:val="uk-UA"/>
               </w:rPr>
-              <w:t>{#items}{</w:t>
+              <w:t>{#items}</w:t>
             </w:r>
             <w:r>
               <w:rPr>
                 <w:b/>
                 <w:bCs/>
-                <w:lang w:val="en-US"/>
-              </w:rPr>
-              <w:t>group-</w:t>
-            </w:r>
-            <w:proofErr w:type="spellStart"/>
-            <w:r>
-              <w:rPr>
-                <w:b/>
-                <w:bCs/>
-                <w:lang w:val="en-US"/>
-              </w:rPr>
-              <w:t>oder</w:t>
-            </w:r>
-            <w:proofErr w:type="spellEnd"/>
-            <w:r>
-              <w:rPr>
-                <w:b/>
-                <w:bCs/>
-                <w:lang w:val="en-US"/>
-              </w:rPr>
-              <w:t>-number</w:t>
-            </w:r>
-            <w:r>
-              <w:rPr>
-                <w:b/>
-                <w:bCs/>
-                <w:lang w:val="uk-UA"/>
-              </w:rPr>
-              <w:t>}</w:t>
+                <w:lang w:val="uk-UA"/>
+              </w:rPr>
+              <w:t>{group-oder-number}</w:t>
             </w:r>
           </w:p>
         </w:tc>
         <w:tc>
           <w:tcPr>
-            <w:tcW w:w="1054" w:type="dxa"/>
+            <w:tcW w:w="1025" w:type="dxa"/>
           </w:tcPr>
           <w:p>
             <w:pPr>
               <w:jc w:val="center"/>
               <w:rPr>
-                <w:lang w:val="en-US"/>
+                <w:lang w:val="uk-UA"/>
               </w:rPr>
             </w:pPr>
             <w:r>
@@ -676,33 +670,25 @@
                 <w:bCs/>
                 <w:lang w:val="uk-UA"/>
               </w:rPr>
-              <w:t>ОД-</w:t>
-            </w:r>
-            <w:r>
-              <w:rPr>
-                <w:b/>
-                <w:bCs/>
-                <w:lang w:val="en-US"/>
-              </w:rPr>
-              <w:t>1/{</w:t>
+              <w:t>{</w:t>
             </w:r>
             <w:proofErr w:type="spellStart"/>
             <w:r>
               <w:rPr>
                 <w:b/>
                 <w:bCs/>
-                <w:lang w:val="en-US"/>
-              </w:rPr>
-              <w:t>sertificate</w:t>
+                <w:lang w:val="uk-UA"/>
+              </w:rPr>
+              <w:t>sertificate-number</w:t>
             </w:r>
             <w:proofErr w:type="spellEnd"/>
             <w:r>
               <w:rPr>
                 <w:b/>
                 <w:bCs/>
-                <w:lang w:val="en-US"/>
-              </w:rPr>
-              <w:t>-number}</w:t>
+                <w:lang w:val="uk-UA"/>
+              </w:rPr>
+              <w:t>}</w:t>
             </w:r>
           </w:p>
         </w:tc>
@@ -764,40 +750,16 @@
               </w:rPr>
               <w:t>{</w:t>
             </w:r>
+            <w:proofErr w:type="spellStart"/>
             <w:r>
               <w:rPr>
                 <w:b/>
                 <w:bCs/>
-                <w:lang w:val="en-US"/>
-              </w:rPr>
-              <w:t>full</w:t>
-            </w:r>
-            <w:r>
-              <w:rPr>
-                <w:b/>
-                <w:bCs/>
-                <w:lang w:val="uk-UA"/>
-              </w:rPr>
-              <w:t>-</w:t>
-            </w:r>
-            <w:proofErr w:type="spellStart"/>
-            <w:r>
-              <w:rPr>
-                <w:b/>
-                <w:bCs/>
-                <w:lang w:val="uk-UA"/>
-              </w:rPr>
-              <w:t>name</w:t>
+                <w:lang w:val="uk-UA"/>
+              </w:rPr>
+              <w:t>full-name-birthday</w:t>
             </w:r>
             <w:proofErr w:type="spellEnd"/>
-            <w:r>
-              <w:rPr>
-                <w:b/>
-                <w:bCs/>
-                <w:lang w:val="en-US"/>
-              </w:rPr>
-              <w:t>-birthday</w:t>
-            </w:r>
             <w:r>
               <w:rPr>
                 <w:b/>
@@ -836,15 +798,15 @@
               </w:rPr>
               <w:t>work-experience-years</w:t>
             </w:r>
-            <w:proofErr w:type="spellEnd"/>
             <w:r>
               <w:rPr>
                 <w:b/>
                 <w:bCs/>
-                <w:lang w:val="en-US"/>
+                <w:lang w:val="uk-UA"/>
               </w:rPr>
               <w:t>-work-company</w:t>
             </w:r>
+            <w:proofErr w:type="spellEnd"/>
             <w:r>
               <w:rPr>
                 <w:b/>
@@ -863,7 +825,7 @@
             <w:pPr>
               <w:jc w:val="center"/>
               <w:rPr>
-                <w:lang w:val="en-US"/>
+                <w:lang w:val="uk-UA"/>
               </w:rPr>
             </w:pPr>
             <w:r>
@@ -964,7 +926,7 @@
     <w:p>
       <w:pPr>
         <w:rPr>
-          <w:lang w:val="en-US"/>
+          <w:lang w:val="uk-UA"/>
         </w:rPr>
       </w:pPr>
     </w:p>
@@ -988,6 +950,12 @@
         </w:rPr>
         <w:t>Експерт УАКЗ                                  _______________</w:t>
       </w:r>
+      <w:r>
+        <w:rPr>
+          <w:lang w:val="uk-UA"/>
+        </w:rPr>
+        <w:t xml:space="preserve"> __________________________</w:t>
+      </w:r>
     </w:p>
     <w:p>
       <w:pPr>
@@ -1005,22 +973,6 @@
           <w:lang w:val="uk-UA"/>
         </w:rPr>
         <w:tab/>
-      </w:r>
-      <w:r>
-        <w:rPr>
-          <w:sz w:val="24"/>
-          <w:szCs w:val="24"/>
-          <w:lang w:val="uk-UA"/>
-        </w:rPr>
-        <w:tab/>
-      </w:r>
-      <w:r>
-        <w:rPr>
-          <w:sz w:val="24"/>
-          <w:szCs w:val="24"/>
-          <w:lang w:val="uk-UA"/>
-        </w:rPr>
-        <w:tab/>
         <w:t>(підпис)</w:t>
       </w:r>
     </w:p>
@@ -1043,23 +995,23 @@
           <w:tab w:val="left" w:pos="4253"/>
         </w:tabs>
         <w:rPr>
-          <w:sz w:val="24"/>
-          <w:szCs w:val="24"/>
-          <w:lang w:val="uk-UA"/>
-        </w:rPr>
-      </w:pPr>
-      <w:r>
-        <w:rPr>
-          <w:sz w:val="24"/>
-          <w:szCs w:val="24"/>
+          <w:sz w:val="22"/>
+          <w:szCs w:val="22"/>
+          <w:lang w:val="uk-UA"/>
+        </w:rPr>
+      </w:pPr>
+      <w:r>
+        <w:rPr>
+          <w:sz w:val="22"/>
+          <w:szCs w:val="22"/>
           <w:lang w:val="uk-UA"/>
         </w:rPr>
         <w:t>Голова комісії:</w:t>
       </w:r>
       <w:r>
         <w:rPr>
-          <w:sz w:val="24"/>
-          <w:szCs w:val="24"/>
+          <w:sz w:val="22"/>
+          <w:szCs w:val="22"/>
           <w:lang w:val="uk-UA"/>
         </w:rPr>
         <w:tab/>
@@ -1068,8 +1020,8 @@
         <w:rPr>
           <w:b/>
           <w:bCs/>
-          <w:sz w:val="24"/>
-          <w:szCs w:val="24"/>
+          <w:sz w:val="22"/>
+          <w:szCs w:val="22"/>
           <w:lang w:val="uk-UA"/>
         </w:rPr>
         <w:t>{</w:t>
@@ -1079,8 +1031,8 @@
         <w:rPr>
           <w:b/>
           <w:bCs/>
-          <w:sz w:val="24"/>
-          <w:szCs w:val="24"/>
+          <w:sz w:val="22"/>
+          <w:szCs w:val="22"/>
           <w:lang w:val="uk-UA"/>
         </w:rPr>
         <w:t>chairperson</w:t>
@@ -1090,8 +1042,8 @@
         <w:rPr>
           <w:b/>
           <w:bCs/>
-          <w:sz w:val="24"/>
-          <w:szCs w:val="24"/>
+          <w:sz w:val="22"/>
+          <w:szCs w:val="22"/>
           <w:lang w:val="uk-UA"/>
         </w:rPr>
         <w:t>}</w:t>
@@ -1100,8 +1052,8 @@
         <w:rPr>
           <w:b/>
           <w:bCs/>
-          <w:sz w:val="24"/>
-          <w:szCs w:val="24"/>
+          <w:sz w:val="22"/>
+          <w:szCs w:val="22"/>
           <w:lang w:val="uk-UA"/>
         </w:rPr>
         <w:tab/>
@@ -1115,23 +1067,23 @@
           <w:tab w:val="left" w:pos="4253"/>
         </w:tabs>
         <w:rPr>
-          <w:sz w:val="24"/>
-          <w:szCs w:val="24"/>
-          <w:lang w:val="uk-UA"/>
-        </w:rPr>
-      </w:pPr>
-      <w:r>
-        <w:rPr>
-          <w:sz w:val="24"/>
-          <w:szCs w:val="24"/>
+          <w:sz w:val="22"/>
+          <w:szCs w:val="22"/>
+          <w:lang w:val="uk-UA"/>
+        </w:rPr>
+      </w:pPr>
+      <w:r>
+        <w:rPr>
+          <w:sz w:val="22"/>
+          <w:szCs w:val="22"/>
           <w:lang w:val="uk-UA"/>
         </w:rPr>
         <w:t>Члени  комісії:</w:t>
       </w:r>
       <w:r>
         <w:rPr>
-          <w:sz w:val="24"/>
-          <w:szCs w:val="24"/>
+          <w:sz w:val="22"/>
+          <w:szCs w:val="22"/>
           <w:lang w:val="uk-UA"/>
         </w:rPr>
         <w:tab/>
@@ -1140,14 +1092,14 @@
     <w:p>
       <w:pPr>
         <w:tabs>
-          <w:tab w:val="left" w:pos="1843"/>
           <w:tab w:val="left" w:pos="4253"/>
         </w:tabs>
+        <w:ind w:firstLine="1843"/>
         <w:rPr>
           <w:b/>
           <w:bCs/>
-          <w:sz w:val="24"/>
-          <w:szCs w:val="24"/>
+          <w:sz w:val="22"/>
+          <w:szCs w:val="22"/>
           <w:lang w:val="uk-UA"/>
         </w:rPr>
       </w:pPr>
@@ -1155,59 +1107,77 @@
         <w:rPr>
           <w:b/>
           <w:bCs/>
-          <w:sz w:val="24"/>
-          <w:szCs w:val="24"/>
-          <w:lang w:val="uk-UA"/>
-        </w:rPr>
-        <w:tab/>
-        <w:t xml:space="preserve">{#items}{member-1} </w:t>
-      </w:r>
-      <w:r>
+          <w:sz w:val="22"/>
+          <w:szCs w:val="22"/>
+          <w:lang w:val="uk-UA"/>
+        </w:rPr>
+        <w:t>{#commissionItems}</w:t>
+      </w:r>
+    </w:p>
+    <w:p>
+      <w:pPr>
+        <w:tabs>
+          <w:tab w:val="left" w:pos="4253"/>
+        </w:tabs>
+        <w:ind w:firstLine="1843"/>
         <w:rPr>
           <w:b/>
           <w:bCs/>
-          <w:sz w:val="24"/>
-          <w:szCs w:val="24"/>
-          <w:lang w:val="en-US"/>
-        </w:rPr>
-        <w:tab/>
-      </w:r>
+          <w:sz w:val="22"/>
+          <w:szCs w:val="22"/>
+          <w:lang w:val="uk-UA"/>
+        </w:rPr>
+      </w:pPr>
       <w:r>
         <w:rPr>
           <w:b/>
           <w:bCs/>
-          <w:sz w:val="24"/>
-          <w:szCs w:val="24"/>
-          <w:lang w:val="uk-UA"/>
-        </w:rPr>
-        <w:t>_________{/</w:t>
+          <w:sz w:val="22"/>
+          <w:szCs w:val="22"/>
+          <w:lang w:val="uk-UA"/>
+        </w:rPr>
+        <w:t>{</w:t>
       </w:r>
       <w:proofErr w:type="spellStart"/>
       <w:r>
         <w:rPr>
           <w:b/>
           <w:bCs/>
-          <w:sz w:val="24"/>
-          <w:szCs w:val="24"/>
-          <w:lang w:val="uk-UA"/>
-        </w:rPr>
-        <w:t>items</w:t>
+          <w:sz w:val="22"/>
+          <w:szCs w:val="22"/>
+          <w:lang w:val="uk-UA"/>
+        </w:rPr>
+        <w:t>member</w:t>
       </w:r>
       <w:proofErr w:type="spellEnd"/>
       <w:r>
         <w:rPr>
           <w:b/>
           <w:bCs/>
-          <w:sz w:val="24"/>
-          <w:szCs w:val="24"/>
-          <w:lang w:val="uk-UA"/>
-        </w:rPr>
-        <w:t>}</w:t>
+          <w:sz w:val="22"/>
+          <w:szCs w:val="22"/>
+          <w:lang w:val="uk-UA"/>
+        </w:rPr>
+        <w:t xml:space="preserve">} </w:t>
+      </w:r>
+      <w:r>
+        <w:rPr>
+          <w:b/>
+          <w:bCs/>
+          <w:sz w:val="22"/>
+          <w:szCs w:val="22"/>
+          <w:lang w:val="uk-UA"/>
+        </w:rPr>
+        <w:tab/>
+        <w:t>_________</w:t>
       </w:r>
     </w:p>
     <w:p>
       <w:pPr>
-        <w:jc w:val="center"/>
+        <w:tabs>
+          <w:tab w:val="left" w:pos="4253"/>
+        </w:tabs>
+        <w:ind w:firstLine="1843"/>
         <w:rPr>
           <w:b/>
           <w:bCs/>
@@ -1216,6 +1186,38 @@
           <w:lang w:val="uk-UA"/>
         </w:rPr>
       </w:pPr>
+      <w:r>
+        <w:rPr>
+          <w:b/>
+          <w:bCs/>
+          <w:sz w:val="22"/>
+          <w:szCs w:val="22"/>
+          <w:lang w:val="uk-UA"/>
+        </w:rPr>
+        <w:t>{/</w:t>
+      </w:r>
+      <w:proofErr w:type="spellStart"/>
+      <w:r>
+        <w:rPr>
+          <w:b/>
+          <w:bCs/>
+          <w:sz w:val="22"/>
+          <w:szCs w:val="22"/>
+          <w:lang w:val="uk-UA"/>
+        </w:rPr>
+        <w:t>commissionItems</w:t>
+      </w:r>
+      <w:proofErr w:type="spellEnd"/>
+      <w:r>
+        <w:rPr>
+          <w:b/>
+          <w:bCs/>
+          <w:sz w:val="22"/>
+          <w:szCs w:val="22"/>
+          <w:lang w:val="uk-UA"/>
+        </w:rPr>
+        <w:t>}</w:t>
+      </w:r>
     </w:p>
     <w:sectPr>
       <w:pgSz w:w="16840" w:h="11907" w:orient="landscape"/>

</xml_diff>